<commit_message>
Name the sections as noun phrases
Four of the subsection headings were full sentences stating their own
conclusion -- 1.2, 1.3, 1.5 and 1.6 -- which read as claims rather than
labels and duplicated the sentence the body already made. They are now
noun phrases naming the subject, and 1.4 gained a head noun for parallel
structure. The conclusions themselves are untouched; each still appears
in the body of its section.

Heading lengths all stay on one line, so the page estimate is unchanged
at 1.92.

Co-Authored-By: Claude Opus 5 <noreply@anthropic.com>
Claude-Session: https://claude.ai/code/session_0141VqjeYRkF3mE3XUJXaHR5
</commit_message>
<xml_diff>
--- a/report/PARC2026_report.docx
+++ b/report/PARC2026_report.docx
@@ -92,7 +92,7 @@
           <w:sz w:val="19"/>
           <w:szCs w:val="19"/>
         </w:rPr>
-        <w:t xml:space="preserve">1.2 決定的な行動ヘッドが「平均」の設計を規定した</w:t>
+        <w:t xml:space="preserve">1.2 決定的な行動ヘッドと平均化の設計</w:t>
       </w:r>
     </w:p>
     <w:p>
@@ -597,7 +597,7 @@
           <w:sz w:val="19"/>
           <w:szCs w:val="19"/>
         </w:rPr>
-        <w:t xml:space="preserve">1.3 TTA は視点数ではなく「倍率列の平均位置」で決まっていた</w:t>
+        <w:t xml:space="preserve">1.3 TTA の効き方を決める倍率列の平均位置</w:t>
       </w:r>
     </w:p>
     <w:p>
@@ -667,7 +667,7 @@
           <w:sz w:val="19"/>
           <w:szCs w:val="19"/>
         </w:rPr>
-        <w:t xml:space="preserve">1.4 効かなかった軸</w:t>
+        <w:t xml:space="preserve">1.4 効かなかった軸の一覧</w:t>
       </w:r>
     </w:p>
     <w:p>
@@ -1216,7 +1216,7 @@
           <w:sz w:val="19"/>
           <w:szCs w:val="19"/>
         </w:rPr>
-        <w:t xml:space="preserve">1.5 残った失敗 4 本はすべてヒューリスティックの射程外だった</w:t>
+        <w:t xml:space="preserve">1.5 残った失敗 4 本の内訳とヒューリスティックの限界</w:t>
       </w:r>
     </w:p>
     <w:p>
@@ -1697,7 +1697,7 @@
           <w:sz w:val="19"/>
           <w:szCs w:val="19"/>
         </w:rPr>
-        <w:t xml:space="preserve">1.6 採点式を逆解析して提出枠の配分を決めた</w:t>
+        <w:t xml:space="preserve">1.6 採点式の逆解析と提出枠の配分</w:t>
       </w:r>
     </w:p>
     <w:p>

</xml_diff>